<commit_message>
Update laporan UAS PDF
</commit_message>
<xml_diff>
--- a/3124510015_Muhamad Airul Mustakim - Laporan Projek UAS.docx
+++ b/3124510015_Muhamad Airul Mustakim - Laporan Projek UAS.docx
@@ -153,12 +153,6 @@
         <w:gridCol w:w="9026"/>
       </w:tblGrid>
       <w:tr>
-        <w:tblPrEx>
-          <w:tblCellMar>
-            <w:top w:w="0" w:type="dxa"/>
-            <w:bottom w:w="0" w:type="dxa"/>
-          </w:tblCellMar>
-        </w:tblPrEx>
         <w:trPr>
           <w:trHeight w:hRule="exact" w:val="6000"/>
         </w:trPr>
@@ -377,14 +371,7 @@
           <w:b/>
           <w:bCs/>
         </w:rPr>
-        <w:t>NRP</w:t>
-      </w:r>
-      <w:r>
-        <w:rPr>
-          <w:b/>
-          <w:bCs/>
-        </w:rPr>
-        <w:t>: 3124510015</w:t>
+        <w:t>NRP: 3124510015</w:t>
       </w:r>
     </w:p>
     <w:p/>
@@ -3681,18 +3668,13 @@
       </w:r>
       <w:proofErr w:type="spellEnd"/>
       <w:r>
-        <w:t xml:space="preserve">), </w:t>
-      </w:r>
-      <w:proofErr w:type="gramStart"/>
-      <w:r>
-        <w:t>dan .</w:t>
+        <w:t>), dan .</w:t>
       </w:r>
       <w:proofErr w:type="spellStart"/>
       <w:r>
         <w:t>prj</w:t>
       </w:r>
       <w:proofErr w:type="spellEnd"/>
-      <w:proofErr w:type="gramEnd"/>
       <w:r>
         <w:t xml:space="preserve"> (</w:t>
       </w:r>
@@ -4963,12 +4945,6 @@
         <w:gridCol w:w="2000"/>
       </w:tblGrid>
       <w:tr>
-        <w:tblPrEx>
-          <w:tblCellMar>
-            <w:top w:w="0" w:type="dxa"/>
-            <w:bottom w:w="0" w:type="dxa"/>
-          </w:tblCellMar>
-        </w:tblPrEx>
         <w:trPr>
           <w:tblHeader/>
         </w:trPr>
@@ -5144,12 +5120,6 @@
         </w:tc>
       </w:tr>
       <w:tr>
-        <w:tblPrEx>
-          <w:tblCellMar>
-            <w:top w:w="0" w:type="dxa"/>
-            <w:bottom w:w="0" w:type="dxa"/>
-          </w:tblCellMar>
-        </w:tblPrEx>
         <w:tc>
           <w:tcPr>
             <w:tcW w:w="700" w:type="dxa"/>
@@ -5311,12 +5281,6 @@
         </w:tc>
       </w:tr>
       <w:tr>
-        <w:tblPrEx>
-          <w:tblCellMar>
-            <w:top w:w="0" w:type="dxa"/>
-            <w:bottom w:w="0" w:type="dxa"/>
-          </w:tblCellMar>
-        </w:tblPrEx>
         <w:tc>
           <w:tcPr>
             <w:tcW w:w="700" w:type="dxa"/>
@@ -5478,12 +5442,6 @@
         </w:tc>
       </w:tr>
       <w:tr>
-        <w:tblPrEx>
-          <w:tblCellMar>
-            <w:top w:w="0" w:type="dxa"/>
-            <w:bottom w:w="0" w:type="dxa"/>
-          </w:tblCellMar>
-        </w:tblPrEx>
         <w:tc>
           <w:tcPr>
             <w:tcW w:w="700" w:type="dxa"/>
@@ -5645,12 +5603,6 @@
         </w:tc>
       </w:tr>
       <w:tr>
-        <w:tblPrEx>
-          <w:tblCellMar>
-            <w:top w:w="0" w:type="dxa"/>
-            <w:bottom w:w="0" w:type="dxa"/>
-          </w:tblCellMar>
-        </w:tblPrEx>
         <w:tc>
           <w:tcPr>
             <w:tcW w:w="700" w:type="dxa"/>
@@ -5820,12 +5772,6 @@
         </w:tc>
       </w:tr>
       <w:tr>
-        <w:tblPrEx>
-          <w:tblCellMar>
-            <w:top w:w="0" w:type="dxa"/>
-            <w:bottom w:w="0" w:type="dxa"/>
-          </w:tblCellMar>
-        </w:tblPrEx>
         <w:tc>
           <w:tcPr>
             <w:tcW w:w="700" w:type="dxa"/>
@@ -5985,12 +5931,6 @@
         </w:tc>
       </w:tr>
       <w:tr>
-        <w:tblPrEx>
-          <w:tblCellMar>
-            <w:top w:w="0" w:type="dxa"/>
-            <w:bottom w:w="0" w:type="dxa"/>
-          </w:tblCellMar>
-        </w:tblPrEx>
         <w:tc>
           <w:tcPr>
             <w:tcW w:w="700" w:type="dxa"/>
@@ -6152,12 +6092,6 @@
         </w:tc>
       </w:tr>
       <w:tr>
-        <w:tblPrEx>
-          <w:tblCellMar>
-            <w:top w:w="0" w:type="dxa"/>
-            <w:bottom w:w="0" w:type="dxa"/>
-          </w:tblCellMar>
-        </w:tblPrEx>
         <w:tc>
           <w:tcPr>
             <w:tcW w:w="700" w:type="dxa"/>
@@ -6327,12 +6261,6 @@
         </w:tc>
       </w:tr>
       <w:tr>
-        <w:tblPrEx>
-          <w:tblCellMar>
-            <w:top w:w="0" w:type="dxa"/>
-            <w:bottom w:w="0" w:type="dxa"/>
-          </w:tblCellMar>
-        </w:tblPrEx>
         <w:tc>
           <w:tcPr>
             <w:tcW w:w="700" w:type="dxa"/>
@@ -6494,12 +6422,6 @@
         </w:tc>
       </w:tr>
       <w:tr>
-        <w:tblPrEx>
-          <w:tblCellMar>
-            <w:top w:w="0" w:type="dxa"/>
-            <w:bottom w:w="0" w:type="dxa"/>
-          </w:tblCellMar>
-        </w:tblPrEx>
         <w:tc>
           <w:tcPr>
             <w:tcW w:w="700" w:type="dxa"/>
@@ -6661,12 +6583,6 @@
         </w:tc>
       </w:tr>
       <w:tr>
-        <w:tblPrEx>
-          <w:tblCellMar>
-            <w:top w:w="0" w:type="dxa"/>
-            <w:bottom w:w="0" w:type="dxa"/>
-          </w:tblCellMar>
-        </w:tblPrEx>
         <w:tc>
           <w:tcPr>
             <w:tcW w:w="700" w:type="dxa"/>
@@ -6828,12 +6744,6 @@
         </w:tc>
       </w:tr>
       <w:tr>
-        <w:tblPrEx>
-          <w:tblCellMar>
-            <w:top w:w="0" w:type="dxa"/>
-            <w:bottom w:w="0" w:type="dxa"/>
-          </w:tblCellMar>
-        </w:tblPrEx>
         <w:tc>
           <w:tcPr>
             <w:tcW w:w="700" w:type="dxa"/>
@@ -6995,12 +6905,6 @@
         </w:tc>
       </w:tr>
       <w:tr>
-        <w:tblPrEx>
-          <w:tblCellMar>
-            <w:top w:w="0" w:type="dxa"/>
-            <w:bottom w:w="0" w:type="dxa"/>
-          </w:tblCellMar>
-        </w:tblPrEx>
         <w:tc>
           <w:tcPr>
             <w:tcW w:w="700" w:type="dxa"/>
@@ -7162,12 +7066,6 @@
         </w:tc>
       </w:tr>
       <w:tr>
-        <w:tblPrEx>
-          <w:tblCellMar>
-            <w:top w:w="0" w:type="dxa"/>
-            <w:bottom w:w="0" w:type="dxa"/>
-          </w:tblCellMar>
-        </w:tblPrEx>
         <w:tc>
           <w:tcPr>
             <w:tcW w:w="700" w:type="dxa"/>
@@ -7329,12 +7227,6 @@
         </w:tc>
       </w:tr>
       <w:tr>
-        <w:tblPrEx>
-          <w:tblCellMar>
-            <w:top w:w="0" w:type="dxa"/>
-            <w:bottom w:w="0" w:type="dxa"/>
-          </w:tblCellMar>
-        </w:tblPrEx>
         <w:tc>
           <w:tcPr>
             <w:tcW w:w="700" w:type="dxa"/>
@@ -7496,12 +7388,6 @@
         </w:tc>
       </w:tr>
       <w:tr>
-        <w:tblPrEx>
-          <w:tblCellMar>
-            <w:top w:w="0" w:type="dxa"/>
-            <w:bottom w:w="0" w:type="dxa"/>
-          </w:tblCellMar>
-        </w:tblPrEx>
         <w:tc>
           <w:tcPr>
             <w:tcW w:w="700" w:type="dxa"/>
@@ -7663,12 +7549,6 @@
         </w:tc>
       </w:tr>
       <w:tr>
-        <w:tblPrEx>
-          <w:tblCellMar>
-            <w:top w:w="0" w:type="dxa"/>
-            <w:bottom w:w="0" w:type="dxa"/>
-          </w:tblCellMar>
-        </w:tblPrEx>
         <w:tc>
           <w:tcPr>
             <w:tcW w:w="700" w:type="dxa"/>
@@ -7830,12 +7710,6 @@
         </w:tc>
       </w:tr>
       <w:tr>
-        <w:tblPrEx>
-          <w:tblCellMar>
-            <w:top w:w="0" w:type="dxa"/>
-            <w:bottom w:w="0" w:type="dxa"/>
-          </w:tblCellMar>
-        </w:tblPrEx>
         <w:tc>
           <w:tcPr>
             <w:tcW w:w="700" w:type="dxa"/>
@@ -7997,12 +7871,6 @@
         </w:tc>
       </w:tr>
       <w:tr>
-        <w:tblPrEx>
-          <w:tblCellMar>
-            <w:top w:w="0" w:type="dxa"/>
-            <w:bottom w:w="0" w:type="dxa"/>
-          </w:tblCellMar>
-        </w:tblPrEx>
         <w:tc>
           <w:tcPr>
             <w:tcW w:w="700" w:type="dxa"/>
@@ -8164,12 +8032,6 @@
         </w:tc>
       </w:tr>
       <w:tr>
-        <w:tblPrEx>
-          <w:tblCellMar>
-            <w:top w:w="0" w:type="dxa"/>
-            <w:bottom w:w="0" w:type="dxa"/>
-          </w:tblCellMar>
-        </w:tblPrEx>
         <w:tc>
           <w:tcPr>
             <w:tcW w:w="700" w:type="dxa"/>
@@ -8765,12 +8627,6 @@
         <w:gridCol w:w="2400"/>
       </w:tblGrid>
       <w:tr>
-        <w:tblPrEx>
-          <w:tblCellMar>
-            <w:top w:w="0" w:type="dxa"/>
-            <w:bottom w:w="0" w:type="dxa"/>
-          </w:tblCellMar>
-        </w:tblPrEx>
         <w:trPr>
           <w:tblHeader/>
         </w:trPr>
@@ -8914,12 +8770,6 @@
         </w:tc>
       </w:tr>
       <w:tr>
-        <w:tblPrEx>
-          <w:tblCellMar>
-            <w:top w:w="0" w:type="dxa"/>
-            <w:bottom w:w="0" w:type="dxa"/>
-          </w:tblCellMar>
-        </w:tblPrEx>
         <w:tc>
           <w:tcPr>
             <w:tcW w:w="700" w:type="dxa"/>
@@ -9079,12 +8929,6 @@
         </w:tc>
       </w:tr>
       <w:tr>
-        <w:tblPrEx>
-          <w:tblCellMar>
-            <w:top w:w="0" w:type="dxa"/>
-            <w:bottom w:w="0" w:type="dxa"/>
-          </w:tblCellMar>
-        </w:tblPrEx>
         <w:tc>
           <w:tcPr>
             <w:tcW w:w="700" w:type="dxa"/>
@@ -9246,12 +9090,6 @@
         </w:tc>
       </w:tr>
       <w:tr>
-        <w:tblPrEx>
-          <w:tblCellMar>
-            <w:top w:w="0" w:type="dxa"/>
-            <w:bottom w:w="0" w:type="dxa"/>
-          </w:tblCellMar>
-        </w:tblPrEx>
         <w:tc>
           <w:tcPr>
             <w:tcW w:w="700" w:type="dxa"/>
@@ -9405,12 +9243,6 @@
         </w:tc>
       </w:tr>
       <w:tr>
-        <w:tblPrEx>
-          <w:tblCellMar>
-            <w:top w:w="0" w:type="dxa"/>
-            <w:bottom w:w="0" w:type="dxa"/>
-          </w:tblCellMar>
-        </w:tblPrEx>
         <w:tc>
           <w:tcPr>
             <w:tcW w:w="700" w:type="dxa"/>
@@ -9552,12 +9384,6 @@
         </w:tc>
       </w:tr>
       <w:tr>
-        <w:tblPrEx>
-          <w:tblCellMar>
-            <w:top w:w="0" w:type="dxa"/>
-            <w:bottom w:w="0" w:type="dxa"/>
-          </w:tblCellMar>
-        </w:tblPrEx>
         <w:tc>
           <w:tcPr>
             <w:tcW w:w="700" w:type="dxa"/>
@@ -9711,12 +9537,6 @@
         </w:tc>
       </w:tr>
       <w:tr>
-        <w:tblPrEx>
-          <w:tblCellMar>
-            <w:top w:w="0" w:type="dxa"/>
-            <w:bottom w:w="0" w:type="dxa"/>
-          </w:tblCellMar>
-        </w:tblPrEx>
         <w:tc>
           <w:tcPr>
             <w:tcW w:w="700" w:type="dxa"/>
@@ -9850,12 +9670,6 @@
         </w:tc>
       </w:tr>
       <w:tr>
-        <w:tblPrEx>
-          <w:tblCellMar>
-            <w:top w:w="0" w:type="dxa"/>
-            <w:bottom w:w="0" w:type="dxa"/>
-          </w:tblCellMar>
-        </w:tblPrEx>
         <w:tc>
           <w:tcPr>
             <w:tcW w:w="700" w:type="dxa"/>
@@ -10009,12 +9823,6 @@
         </w:tc>
       </w:tr>
       <w:tr>
-        <w:tblPrEx>
-          <w:tblCellMar>
-            <w:top w:w="0" w:type="dxa"/>
-            <w:bottom w:w="0" w:type="dxa"/>
-          </w:tblCellMar>
-        </w:tblPrEx>
         <w:tc>
           <w:tcPr>
             <w:tcW w:w="700" w:type="dxa"/>
@@ -10160,12 +9968,6 @@
         </w:tc>
       </w:tr>
       <w:tr>
-        <w:tblPrEx>
-          <w:tblCellMar>
-            <w:top w:w="0" w:type="dxa"/>
-            <w:bottom w:w="0" w:type="dxa"/>
-          </w:tblCellMar>
-        </w:tblPrEx>
         <w:tc>
           <w:tcPr>
             <w:tcW w:w="700" w:type="dxa"/>
@@ -10311,12 +10113,6 @@
         </w:tc>
       </w:tr>
       <w:tr>
-        <w:tblPrEx>
-          <w:tblCellMar>
-            <w:top w:w="0" w:type="dxa"/>
-            <w:bottom w:w="0" w:type="dxa"/>
-          </w:tblCellMar>
-        </w:tblPrEx>
         <w:tc>
           <w:tcPr>
             <w:tcW w:w="700" w:type="dxa"/>
@@ -10460,12 +10256,6 @@
         </w:tc>
       </w:tr>
       <w:tr>
-        <w:tblPrEx>
-          <w:tblCellMar>
-            <w:top w:w="0" w:type="dxa"/>
-            <w:bottom w:w="0" w:type="dxa"/>
-          </w:tblCellMar>
-        </w:tblPrEx>
         <w:tc>
           <w:tcPr>
             <w:tcW w:w="700" w:type="dxa"/>
@@ -10627,12 +10417,6 @@
         </w:tc>
       </w:tr>
       <w:tr>
-        <w:tblPrEx>
-          <w:tblCellMar>
-            <w:top w:w="0" w:type="dxa"/>
-            <w:bottom w:w="0" w:type="dxa"/>
-          </w:tblCellMar>
-        </w:tblPrEx>
         <w:tc>
           <w:tcPr>
             <w:tcW w:w="700" w:type="dxa"/>
@@ -10766,12 +10550,6 @@
         </w:tc>
       </w:tr>
       <w:tr>
-        <w:tblPrEx>
-          <w:tblCellMar>
-            <w:top w:w="0" w:type="dxa"/>
-            <w:bottom w:w="0" w:type="dxa"/>
-          </w:tblCellMar>
-        </w:tblPrEx>
         <w:tc>
           <w:tcPr>
             <w:tcW w:w="700" w:type="dxa"/>
@@ -10913,12 +10691,6 @@
         </w:tc>
       </w:tr>
       <w:tr>
-        <w:tblPrEx>
-          <w:tblCellMar>
-            <w:top w:w="0" w:type="dxa"/>
-            <w:bottom w:w="0" w:type="dxa"/>
-          </w:tblCellMar>
-        </w:tblPrEx>
         <w:tc>
           <w:tcPr>
             <w:tcW w:w="700" w:type="dxa"/>
@@ -11040,12 +10812,6 @@
         </w:tc>
       </w:tr>
       <w:tr>
-        <w:tblPrEx>
-          <w:tblCellMar>
-            <w:top w:w="0" w:type="dxa"/>
-            <w:bottom w:w="0" w:type="dxa"/>
-          </w:tblCellMar>
-        </w:tblPrEx>
         <w:tc>
           <w:tcPr>
             <w:tcW w:w="700" w:type="dxa"/>
@@ -11179,12 +10945,6 @@
         </w:tc>
       </w:tr>
       <w:tr>
-        <w:tblPrEx>
-          <w:tblCellMar>
-            <w:top w:w="0" w:type="dxa"/>
-            <w:bottom w:w="0" w:type="dxa"/>
-          </w:tblCellMar>
-        </w:tblPrEx>
         <w:tc>
           <w:tcPr>
             <w:tcW w:w="700" w:type="dxa"/>
@@ -11320,12 +11080,6 @@
         </w:tc>
       </w:tr>
       <w:tr>
-        <w:tblPrEx>
-          <w:tblCellMar>
-            <w:top w:w="0" w:type="dxa"/>
-            <w:bottom w:w="0" w:type="dxa"/>
-          </w:tblCellMar>
-        </w:tblPrEx>
         <w:tc>
           <w:tcPr>
             <w:tcW w:w="700" w:type="dxa"/>
@@ -11449,12 +11203,6 @@
         </w:tc>
       </w:tr>
       <w:tr>
-        <w:tblPrEx>
-          <w:tblCellMar>
-            <w:top w:w="0" w:type="dxa"/>
-            <w:bottom w:w="0" w:type="dxa"/>
-          </w:tblCellMar>
-        </w:tblPrEx>
         <w:tc>
           <w:tcPr>
             <w:tcW w:w="700" w:type="dxa"/>
@@ -11600,12 +11348,6 @@
         </w:tc>
       </w:tr>
       <w:tr>
-        <w:tblPrEx>
-          <w:tblCellMar>
-            <w:top w:w="0" w:type="dxa"/>
-            <w:bottom w:w="0" w:type="dxa"/>
-          </w:tblCellMar>
-        </w:tblPrEx>
         <w:tc>
           <w:tcPr>
             <w:tcW w:w="700" w:type="dxa"/>
@@ -11751,12 +11493,6 @@
         </w:tc>
       </w:tr>
       <w:tr>
-        <w:tblPrEx>
-          <w:tblCellMar>
-            <w:top w:w="0" w:type="dxa"/>
-            <w:bottom w:w="0" w:type="dxa"/>
-          </w:tblCellMar>
-        </w:tblPrEx>
         <w:tc>
           <w:tcPr>
             <w:tcW w:w="700" w:type="dxa"/>
@@ -11890,12 +11626,6 @@
         </w:tc>
       </w:tr>
       <w:tr>
-        <w:tblPrEx>
-          <w:tblCellMar>
-            <w:top w:w="0" w:type="dxa"/>
-            <w:bottom w:w="0" w:type="dxa"/>
-          </w:tblCellMar>
-        </w:tblPrEx>
         <w:tc>
           <w:tcPr>
             <w:tcW w:w="700" w:type="dxa"/>
@@ -12328,12 +12058,6 @@
         <w:gridCol w:w="9026"/>
       </w:tblGrid>
       <w:tr>
-        <w:tblPrEx>
-          <w:tblCellMar>
-            <w:top w:w="0" w:type="dxa"/>
-            <w:bottom w:w="0" w:type="dxa"/>
-          </w:tblCellMar>
-        </w:tblPrEx>
         <w:trPr>
           <w:trHeight w:hRule="exact" w:val="6500"/>
         </w:trPr>
@@ -12780,7 +12504,6 @@
         <w:t>dbf</w:t>
       </w:r>
       <w:proofErr w:type="spellEnd"/>
-      <w:proofErr w:type="gramStart"/>
       <w:r>
         <w:t>, .</w:t>
       </w:r>
@@ -12789,7 +12512,6 @@
         <w:t>prj</w:t>
       </w:r>
       <w:proofErr w:type="spellEnd"/>
-      <w:proofErr w:type="gramEnd"/>
       <w:r>
         <w:t xml:space="preserve">) </w:t>
       </w:r>
@@ -14667,6 +14389,9 @@
       <w:pPr>
         <w:pStyle w:val="Heading1"/>
         <w:spacing w:before="240" w:after="120"/>
+        <w:rPr>
+          <w:caps/>
+        </w:rPr>
       </w:pPr>
       <w:r>
         <w:rPr>
@@ -14677,742 +14402,25 @@
       </w:r>
     </w:p>
     <w:p>
-      <w:pPr>
-        <w:pStyle w:val="Heading2"/>
-        <w:spacing w:before="200" w:after="100"/>
-      </w:pPr>
-      <w:r>
-        <w:t xml:space="preserve">Lampiran 1. </w:t>
-      </w:r>
-      <w:proofErr w:type="spellStart"/>
-      <w:r>
-        <w:t>Tampilan</w:t>
-      </w:r>
-      <w:proofErr w:type="spellEnd"/>
-      <w:r>
-        <w:t xml:space="preserve"> ArcMap - Layer Batas Desa</w:t>
-      </w:r>
-    </w:p>
-    <w:tbl>
-      <w:tblPr>
-        <w:tblW w:w="9026" w:type="dxa"/>
-        <w:tblBorders>
-          <w:top w:val="single" w:sz="4" w:space="0" w:color="auto"/>
-          <w:left w:val="single" w:sz="4" w:space="0" w:color="auto"/>
-          <w:bottom w:val="single" w:sz="4" w:space="0" w:color="auto"/>
-          <w:right w:val="single" w:sz="4" w:space="0" w:color="auto"/>
-          <w:insideH w:val="single" w:sz="4" w:space="0" w:color="auto"/>
-          <w:insideV w:val="single" w:sz="4" w:space="0" w:color="auto"/>
-        </w:tblBorders>
-        <w:tblCellMar>
-          <w:left w:w="10" w:type="dxa"/>
-          <w:right w:w="10" w:type="dxa"/>
-        </w:tblCellMar>
-        <w:tblLook w:val="04A0" w:firstRow="1" w:lastRow="0" w:firstColumn="1" w:lastColumn="0" w:noHBand="0" w:noVBand="1"/>
-      </w:tblPr>
-      <w:tblGrid>
-        <w:gridCol w:w="9026"/>
-      </w:tblGrid>
-      <w:tr>
-        <w:tblPrEx>
-          <w:tblCellMar>
-            <w:top w:w="0" w:type="dxa"/>
-            <w:bottom w:w="0" w:type="dxa"/>
-          </w:tblCellMar>
-        </w:tblPrEx>
-        <w:trPr>
-          <w:trHeight w:hRule="exact" w:val="5500"/>
-        </w:trPr>
-        <w:tc>
-          <w:tcPr>
-            <w:tcW w:w="9026" w:type="dxa"/>
-            <w:tcBorders>
-              <w:top w:val="single" w:sz="1" w:space="0" w:color="AAAAAA"/>
-              <w:left w:val="single" w:sz="1" w:space="0" w:color="AAAAAA"/>
-              <w:bottom w:val="single" w:sz="1" w:space="0" w:color="AAAAAA"/>
-              <w:right w:val="single" w:sz="1" w:space="0" w:color="AAAAAA"/>
-            </w:tcBorders>
-            <w:shd w:val="clear" w:color="auto" w:fill="F0F0F0"/>
-            <w:tcMar>
-              <w:top w:w="120" w:type="dxa"/>
-              <w:left w:w="120" w:type="dxa"/>
-              <w:bottom w:w="120" w:type="dxa"/>
-              <w:right w:w="120" w:type="dxa"/>
-            </w:tcMar>
-            <w:vAlign w:val="center"/>
-          </w:tcPr>
-          <w:p>
-            <w:pPr>
-              <w:jc w:val="center"/>
-            </w:pPr>
-            <w:r>
-              <w:rPr>
-                <w:b/>
-                <w:bCs/>
-                <w:color w:val="888888"/>
-                <w:sz w:val="22"/>
-                <w:szCs w:val="22"/>
-              </w:rPr>
-              <w:t xml:space="preserve">[ SISIPKAN GAMBAR DI </w:t>
-            </w:r>
-            <w:proofErr w:type="gramStart"/>
-            <w:r>
-              <w:rPr>
-                <w:b/>
-                <w:bCs/>
-                <w:color w:val="888888"/>
-                <w:sz w:val="22"/>
-                <w:szCs w:val="22"/>
-              </w:rPr>
-              <w:t>SINI ]</w:t>
-            </w:r>
-            <w:proofErr w:type="gramEnd"/>
-          </w:p>
-          <w:p>
-            <w:pPr>
-              <w:jc w:val="center"/>
-            </w:pPr>
-            <w:r>
-              <w:rPr>
-                <w:i/>
-                <w:iCs/>
-                <w:color w:val="666666"/>
-                <w:sz w:val="20"/>
-                <w:szCs w:val="20"/>
-              </w:rPr>
-              <w:t xml:space="preserve">Lampiran 1. Screenshot ArcMap - Layer Batas Desa </w:t>
-            </w:r>
-            <w:proofErr w:type="spellStart"/>
-            <w:r>
-              <w:rPr>
-                <w:i/>
-                <w:iCs/>
-                <w:color w:val="666666"/>
-                <w:sz w:val="20"/>
-                <w:szCs w:val="20"/>
-              </w:rPr>
-              <w:t>Kecamatan</w:t>
-            </w:r>
-            <w:proofErr w:type="spellEnd"/>
-            <w:r>
-              <w:rPr>
-                <w:i/>
-                <w:iCs/>
-                <w:color w:val="666666"/>
-                <w:sz w:val="20"/>
-                <w:szCs w:val="20"/>
-              </w:rPr>
-              <w:t xml:space="preserve"> </w:t>
-            </w:r>
-            <w:proofErr w:type="spellStart"/>
-            <w:r>
-              <w:rPr>
-                <w:i/>
-                <w:iCs/>
-                <w:color w:val="666666"/>
-                <w:sz w:val="20"/>
-                <w:szCs w:val="20"/>
-              </w:rPr>
-              <w:t>Sukorejo</w:t>
-            </w:r>
-            <w:proofErr w:type="spellEnd"/>
-          </w:p>
-        </w:tc>
-      </w:tr>
-    </w:tbl>
-    <w:p>
-      <w:pPr>
-        <w:spacing w:before="80" w:after="160"/>
-        <w:jc w:val="center"/>
-      </w:pPr>
-      <w:r>
-        <w:rPr>
-          <w:b/>
-          <w:bCs/>
-          <w:sz w:val="22"/>
-          <w:szCs w:val="22"/>
-        </w:rPr>
-        <w:t xml:space="preserve">Lampiran 1. Screenshot ArcMap - Layer Batas Desa </w:t>
-      </w:r>
-      <w:proofErr w:type="spellStart"/>
-      <w:r>
-        <w:rPr>
-          <w:b/>
-          <w:bCs/>
-          <w:sz w:val="22"/>
-          <w:szCs w:val="22"/>
-        </w:rPr>
-        <w:t>Kecamatan</w:t>
-      </w:r>
-      <w:proofErr w:type="spellEnd"/>
-      <w:r>
-        <w:rPr>
-          <w:b/>
-          <w:bCs/>
-          <w:sz w:val="22"/>
-          <w:szCs w:val="22"/>
-        </w:rPr>
-        <w:t xml:space="preserve"> </w:t>
-      </w:r>
-      <w:proofErr w:type="spellStart"/>
-      <w:r>
-        <w:rPr>
-          <w:b/>
-          <w:bCs/>
-          <w:sz w:val="22"/>
-          <w:szCs w:val="22"/>
-        </w:rPr>
+      <w:r>
+        <w:t xml:space="preserve">Link </w:t>
+      </w:r>
+      <w:proofErr w:type="spellStart"/>
+      <w:r>
+        <w:t>github</w:t>
+      </w:r>
+      <w:proofErr w:type="spellEnd"/>
+      <w:r>
+        <w:t xml:space="preserve">: </w:t>
+      </w:r>
+      <w:r>
+        <w:t>https://github.com/muhamadairul/Projek-UAS-SIG---Peta-Desa-</w:t>
+      </w:r>
+      <w:proofErr w:type="spellStart"/>
+      <w:r>
         <w:t>Sukorejo</w:t>
       </w:r>
       <w:proofErr w:type="spellEnd"/>
-    </w:p>
-    <w:p>
-      <w:pPr>
-        <w:pStyle w:val="Heading2"/>
-        <w:spacing w:before="200" w:after="100"/>
-      </w:pPr>
-      <w:r>
-        <w:t xml:space="preserve">Lampiran 2. </w:t>
-      </w:r>
-      <w:proofErr w:type="spellStart"/>
-      <w:r>
-        <w:t>Tampilan</w:t>
-      </w:r>
-      <w:proofErr w:type="spellEnd"/>
-      <w:r>
-        <w:t xml:space="preserve"> ArcMap - Layer POI</w:t>
-      </w:r>
-    </w:p>
-    <w:tbl>
-      <w:tblPr>
-        <w:tblW w:w="9026" w:type="dxa"/>
-        <w:tblBorders>
-          <w:top w:val="single" w:sz="4" w:space="0" w:color="auto"/>
-          <w:left w:val="single" w:sz="4" w:space="0" w:color="auto"/>
-          <w:bottom w:val="single" w:sz="4" w:space="0" w:color="auto"/>
-          <w:right w:val="single" w:sz="4" w:space="0" w:color="auto"/>
-          <w:insideH w:val="single" w:sz="4" w:space="0" w:color="auto"/>
-          <w:insideV w:val="single" w:sz="4" w:space="0" w:color="auto"/>
-        </w:tblBorders>
-        <w:tblCellMar>
-          <w:left w:w="10" w:type="dxa"/>
-          <w:right w:w="10" w:type="dxa"/>
-        </w:tblCellMar>
-        <w:tblLook w:val="04A0" w:firstRow="1" w:lastRow="0" w:firstColumn="1" w:lastColumn="0" w:noHBand="0" w:noVBand="1"/>
-      </w:tblPr>
-      <w:tblGrid>
-        <w:gridCol w:w="9026"/>
-      </w:tblGrid>
-      <w:tr>
-        <w:tblPrEx>
-          <w:tblCellMar>
-            <w:top w:w="0" w:type="dxa"/>
-            <w:bottom w:w="0" w:type="dxa"/>
-          </w:tblCellMar>
-        </w:tblPrEx>
-        <w:trPr>
-          <w:trHeight w:hRule="exact" w:val="5500"/>
-        </w:trPr>
-        <w:tc>
-          <w:tcPr>
-            <w:tcW w:w="9026" w:type="dxa"/>
-            <w:tcBorders>
-              <w:top w:val="single" w:sz="1" w:space="0" w:color="AAAAAA"/>
-              <w:left w:val="single" w:sz="1" w:space="0" w:color="AAAAAA"/>
-              <w:bottom w:val="single" w:sz="1" w:space="0" w:color="AAAAAA"/>
-              <w:right w:val="single" w:sz="1" w:space="0" w:color="AAAAAA"/>
-            </w:tcBorders>
-            <w:shd w:val="clear" w:color="auto" w:fill="F0F0F0"/>
-            <w:tcMar>
-              <w:top w:w="120" w:type="dxa"/>
-              <w:left w:w="120" w:type="dxa"/>
-              <w:bottom w:w="120" w:type="dxa"/>
-              <w:right w:w="120" w:type="dxa"/>
-            </w:tcMar>
-            <w:vAlign w:val="center"/>
-          </w:tcPr>
-          <w:p>
-            <w:pPr>
-              <w:jc w:val="center"/>
-            </w:pPr>
-            <w:r>
-              <w:rPr>
-                <w:b/>
-                <w:bCs/>
-                <w:color w:val="888888"/>
-                <w:sz w:val="22"/>
-                <w:szCs w:val="22"/>
-              </w:rPr>
-              <w:t xml:space="preserve">[ SISIPKAN GAMBAR DI </w:t>
-            </w:r>
-            <w:proofErr w:type="gramStart"/>
-            <w:r>
-              <w:rPr>
-                <w:b/>
-                <w:bCs/>
-                <w:color w:val="888888"/>
-                <w:sz w:val="22"/>
-                <w:szCs w:val="22"/>
-              </w:rPr>
-              <w:t>SINI ]</w:t>
-            </w:r>
-            <w:proofErr w:type="gramEnd"/>
-          </w:p>
-          <w:p>
-            <w:pPr>
-              <w:jc w:val="center"/>
-            </w:pPr>
-            <w:r>
-              <w:rPr>
-                <w:i/>
-                <w:iCs/>
-                <w:color w:val="666666"/>
-                <w:sz w:val="20"/>
-                <w:szCs w:val="20"/>
-              </w:rPr>
-              <w:t xml:space="preserve">Lampiran 2. Screenshot ArcMap - Layer POI yang Telah </w:t>
-            </w:r>
-            <w:proofErr w:type="spellStart"/>
-            <w:r>
-              <w:rPr>
-                <w:i/>
-                <w:iCs/>
-                <w:color w:val="666666"/>
-                <w:sz w:val="20"/>
-                <w:szCs w:val="20"/>
-              </w:rPr>
-              <w:t>Ditambahkan</w:t>
-            </w:r>
-            <w:proofErr w:type="spellEnd"/>
-          </w:p>
-        </w:tc>
-      </w:tr>
-    </w:tbl>
-    <w:p>
-      <w:pPr>
-        <w:spacing w:before="80" w:after="160"/>
-        <w:jc w:val="center"/>
-      </w:pPr>
-      <w:r>
-        <w:rPr>
-          <w:b/>
-          <w:bCs/>
-          <w:sz w:val="22"/>
-          <w:szCs w:val="22"/>
-        </w:rPr>
-        <w:t xml:space="preserve">Lampiran 2. Screenshot ArcMap - Layer POI yang Telah </w:t>
-      </w:r>
-      <w:proofErr w:type="spellStart"/>
-      <w:r>
-        <w:rPr>
-          <w:b/>
-          <w:bCs/>
-          <w:sz w:val="22"/>
-          <w:szCs w:val="22"/>
-        </w:rPr>
-        <w:t>Ditambahkan</w:t>
-      </w:r>
-      <w:proofErr w:type="spellEnd"/>
-    </w:p>
-    <w:p>
-      <w:pPr>
-        <w:pStyle w:val="Heading2"/>
-        <w:spacing w:before="200" w:after="100"/>
-      </w:pPr>
-      <w:r>
-        <w:t>Lampiran 3. Attribute Table Desa</w:t>
-      </w:r>
-    </w:p>
-    <w:tbl>
-      <w:tblPr>
-        <w:tblW w:w="9026" w:type="dxa"/>
-        <w:tblBorders>
-          <w:top w:val="single" w:sz="4" w:space="0" w:color="auto"/>
-          <w:left w:val="single" w:sz="4" w:space="0" w:color="auto"/>
-          <w:bottom w:val="single" w:sz="4" w:space="0" w:color="auto"/>
-          <w:right w:val="single" w:sz="4" w:space="0" w:color="auto"/>
-          <w:insideH w:val="single" w:sz="4" w:space="0" w:color="auto"/>
-          <w:insideV w:val="single" w:sz="4" w:space="0" w:color="auto"/>
-        </w:tblBorders>
-        <w:tblCellMar>
-          <w:left w:w="10" w:type="dxa"/>
-          <w:right w:w="10" w:type="dxa"/>
-        </w:tblCellMar>
-        <w:tblLook w:val="04A0" w:firstRow="1" w:lastRow="0" w:firstColumn="1" w:lastColumn="0" w:noHBand="0" w:noVBand="1"/>
-      </w:tblPr>
-      <w:tblGrid>
-        <w:gridCol w:w="9026"/>
-      </w:tblGrid>
-      <w:tr>
-        <w:tblPrEx>
-          <w:tblCellMar>
-            <w:top w:w="0" w:type="dxa"/>
-            <w:bottom w:w="0" w:type="dxa"/>
-          </w:tblCellMar>
-        </w:tblPrEx>
-        <w:trPr>
-          <w:trHeight w:hRule="exact" w:val="4500"/>
-        </w:trPr>
-        <w:tc>
-          <w:tcPr>
-            <w:tcW w:w="9026" w:type="dxa"/>
-            <w:tcBorders>
-              <w:top w:val="single" w:sz="1" w:space="0" w:color="AAAAAA"/>
-              <w:left w:val="single" w:sz="1" w:space="0" w:color="AAAAAA"/>
-              <w:bottom w:val="single" w:sz="1" w:space="0" w:color="AAAAAA"/>
-              <w:right w:val="single" w:sz="1" w:space="0" w:color="AAAAAA"/>
-            </w:tcBorders>
-            <w:shd w:val="clear" w:color="auto" w:fill="F0F0F0"/>
-            <w:tcMar>
-              <w:top w:w="120" w:type="dxa"/>
-              <w:left w:w="120" w:type="dxa"/>
-              <w:bottom w:w="120" w:type="dxa"/>
-              <w:right w:w="120" w:type="dxa"/>
-            </w:tcMar>
-            <w:vAlign w:val="center"/>
-          </w:tcPr>
-          <w:p>
-            <w:pPr>
-              <w:jc w:val="center"/>
-            </w:pPr>
-            <w:r>
-              <w:rPr>
-                <w:b/>
-                <w:bCs/>
-                <w:color w:val="888888"/>
-                <w:sz w:val="22"/>
-                <w:szCs w:val="22"/>
-              </w:rPr>
-              <w:lastRenderedPageBreak/>
-              <w:t xml:space="preserve">[ SISIPKAN GAMBAR DI </w:t>
-            </w:r>
-            <w:proofErr w:type="gramStart"/>
-            <w:r>
-              <w:rPr>
-                <w:b/>
-                <w:bCs/>
-                <w:color w:val="888888"/>
-                <w:sz w:val="22"/>
-                <w:szCs w:val="22"/>
-              </w:rPr>
-              <w:t>SINI ]</w:t>
-            </w:r>
-            <w:proofErr w:type="gramEnd"/>
-          </w:p>
-          <w:p>
-            <w:pPr>
-              <w:jc w:val="center"/>
-            </w:pPr>
-            <w:r>
-              <w:rPr>
-                <w:i/>
-                <w:iCs/>
-                <w:color w:val="666666"/>
-                <w:sz w:val="20"/>
-                <w:szCs w:val="20"/>
-              </w:rPr>
-              <w:t>Lampiran 3. Screenshot Attribute Table Layer Desa</w:t>
-            </w:r>
-          </w:p>
-        </w:tc>
-      </w:tr>
-    </w:tbl>
-    <w:p>
-      <w:pPr>
-        <w:spacing w:before="80" w:after="160"/>
-        <w:jc w:val="center"/>
-      </w:pPr>
-      <w:r>
-        <w:rPr>
-          <w:b/>
-          <w:bCs/>
-          <w:sz w:val="22"/>
-          <w:szCs w:val="22"/>
-        </w:rPr>
-        <w:t>Lampiran 3. Screenshot Attribute Table Layer Desa</w:t>
-      </w:r>
-    </w:p>
-    <w:p>
-      <w:pPr>
-        <w:pStyle w:val="Heading2"/>
-        <w:spacing w:before="200" w:after="100"/>
-      </w:pPr>
-      <w:r>
-        <w:t xml:space="preserve">Lampiran 4. Proses Join </w:t>
-      </w:r>
-      <w:proofErr w:type="spellStart"/>
-      <w:r>
-        <w:t>Atribut</w:t>
-      </w:r>
-      <w:proofErr w:type="spellEnd"/>
-    </w:p>
-    <w:tbl>
-      <w:tblPr>
-        <w:tblW w:w="9026" w:type="dxa"/>
-        <w:tblBorders>
-          <w:top w:val="single" w:sz="4" w:space="0" w:color="auto"/>
-          <w:left w:val="single" w:sz="4" w:space="0" w:color="auto"/>
-          <w:bottom w:val="single" w:sz="4" w:space="0" w:color="auto"/>
-          <w:right w:val="single" w:sz="4" w:space="0" w:color="auto"/>
-          <w:insideH w:val="single" w:sz="4" w:space="0" w:color="auto"/>
-          <w:insideV w:val="single" w:sz="4" w:space="0" w:color="auto"/>
-        </w:tblBorders>
-        <w:tblCellMar>
-          <w:left w:w="10" w:type="dxa"/>
-          <w:right w:w="10" w:type="dxa"/>
-        </w:tblCellMar>
-        <w:tblLook w:val="04A0" w:firstRow="1" w:lastRow="0" w:firstColumn="1" w:lastColumn="0" w:noHBand="0" w:noVBand="1"/>
-      </w:tblPr>
-      <w:tblGrid>
-        <w:gridCol w:w="9026"/>
-      </w:tblGrid>
-      <w:tr>
-        <w:tblPrEx>
-          <w:tblCellMar>
-            <w:top w:w="0" w:type="dxa"/>
-            <w:bottom w:w="0" w:type="dxa"/>
-          </w:tblCellMar>
-        </w:tblPrEx>
-        <w:trPr>
-          <w:trHeight w:hRule="exact" w:val="4500"/>
-        </w:trPr>
-        <w:tc>
-          <w:tcPr>
-            <w:tcW w:w="9026" w:type="dxa"/>
-            <w:tcBorders>
-              <w:top w:val="single" w:sz="1" w:space="0" w:color="AAAAAA"/>
-              <w:left w:val="single" w:sz="1" w:space="0" w:color="AAAAAA"/>
-              <w:bottom w:val="single" w:sz="1" w:space="0" w:color="AAAAAA"/>
-              <w:right w:val="single" w:sz="1" w:space="0" w:color="AAAAAA"/>
-            </w:tcBorders>
-            <w:shd w:val="clear" w:color="auto" w:fill="F0F0F0"/>
-            <w:tcMar>
-              <w:top w:w="120" w:type="dxa"/>
-              <w:left w:w="120" w:type="dxa"/>
-              <w:bottom w:w="120" w:type="dxa"/>
-              <w:right w:w="120" w:type="dxa"/>
-            </w:tcMar>
-            <w:vAlign w:val="center"/>
-          </w:tcPr>
-          <w:p>
-            <w:pPr>
-              <w:jc w:val="center"/>
-            </w:pPr>
-            <w:r>
-              <w:rPr>
-                <w:b/>
-                <w:bCs/>
-                <w:color w:val="888888"/>
-                <w:sz w:val="22"/>
-                <w:szCs w:val="22"/>
-              </w:rPr>
-              <w:t xml:space="preserve">[ SISIPKAN GAMBAR DI </w:t>
-            </w:r>
-            <w:proofErr w:type="gramStart"/>
-            <w:r>
-              <w:rPr>
-                <w:b/>
-                <w:bCs/>
-                <w:color w:val="888888"/>
-                <w:sz w:val="22"/>
-                <w:szCs w:val="22"/>
-              </w:rPr>
-              <w:t>SINI ]</w:t>
-            </w:r>
-            <w:proofErr w:type="gramEnd"/>
-          </w:p>
-          <w:p>
-            <w:pPr>
-              <w:jc w:val="center"/>
-            </w:pPr>
-            <w:r>
-              <w:rPr>
-                <w:i/>
-                <w:iCs/>
-                <w:color w:val="666666"/>
-                <w:sz w:val="20"/>
-                <w:szCs w:val="20"/>
-              </w:rPr>
-              <w:t xml:space="preserve">Lampiran 4. Screenshot Proses Join Table </w:t>
-            </w:r>
-            <w:proofErr w:type="spellStart"/>
-            <w:r>
-              <w:rPr>
-                <w:i/>
-                <w:iCs/>
-                <w:color w:val="666666"/>
-                <w:sz w:val="20"/>
-                <w:szCs w:val="20"/>
-              </w:rPr>
-              <w:t>Atribut</w:t>
-            </w:r>
-            <w:proofErr w:type="spellEnd"/>
-            <w:r>
-              <w:rPr>
-                <w:i/>
-                <w:iCs/>
-                <w:color w:val="666666"/>
-                <w:sz w:val="20"/>
-                <w:szCs w:val="20"/>
-              </w:rPr>
-              <w:t xml:space="preserve"> Desa</w:t>
-            </w:r>
-          </w:p>
-        </w:tc>
-      </w:tr>
-    </w:tbl>
-    <w:p>
-      <w:pPr>
-        <w:spacing w:before="80" w:after="160"/>
-        <w:jc w:val="center"/>
-      </w:pPr>
-      <w:r>
-        <w:rPr>
-          <w:b/>
-          <w:bCs/>
-          <w:sz w:val="22"/>
-          <w:szCs w:val="22"/>
-        </w:rPr>
-        <w:t xml:space="preserve">Lampiran 4. Screenshot Proses Join Table </w:t>
-      </w:r>
-      <w:proofErr w:type="spellStart"/>
-      <w:r>
-        <w:rPr>
-          <w:b/>
-          <w:bCs/>
-          <w:sz w:val="22"/>
-          <w:szCs w:val="22"/>
-        </w:rPr>
-        <w:t>Atribut</w:t>
-      </w:r>
-      <w:proofErr w:type="spellEnd"/>
-      <w:r>
-        <w:rPr>
-          <w:b/>
-          <w:bCs/>
-          <w:sz w:val="22"/>
-          <w:szCs w:val="22"/>
-        </w:rPr>
-        <w:t xml:space="preserve"> Desa</w:t>
-      </w:r>
-    </w:p>
-    <w:p>
-      <w:pPr>
-        <w:pStyle w:val="Heading2"/>
-        <w:spacing w:before="200" w:after="100"/>
-      </w:pPr>
-      <w:r>
-        <w:t>Lampiran 5. Layout Peta di ArcMap</w:t>
-      </w:r>
-    </w:p>
-    <w:tbl>
-      <w:tblPr>
-        <w:tblW w:w="9026" w:type="dxa"/>
-        <w:tblBorders>
-          <w:top w:val="single" w:sz="4" w:space="0" w:color="auto"/>
-          <w:left w:val="single" w:sz="4" w:space="0" w:color="auto"/>
-          <w:bottom w:val="single" w:sz="4" w:space="0" w:color="auto"/>
-          <w:right w:val="single" w:sz="4" w:space="0" w:color="auto"/>
-          <w:insideH w:val="single" w:sz="4" w:space="0" w:color="auto"/>
-          <w:insideV w:val="single" w:sz="4" w:space="0" w:color="auto"/>
-        </w:tblBorders>
-        <w:tblCellMar>
-          <w:left w:w="10" w:type="dxa"/>
-          <w:right w:w="10" w:type="dxa"/>
-        </w:tblCellMar>
-        <w:tblLook w:val="04A0" w:firstRow="1" w:lastRow="0" w:firstColumn="1" w:lastColumn="0" w:noHBand="0" w:noVBand="1"/>
-      </w:tblPr>
-      <w:tblGrid>
-        <w:gridCol w:w="9026"/>
-      </w:tblGrid>
-      <w:tr>
-        <w:tblPrEx>
-          <w:tblCellMar>
-            <w:top w:w="0" w:type="dxa"/>
-            <w:bottom w:w="0" w:type="dxa"/>
-          </w:tblCellMar>
-        </w:tblPrEx>
-        <w:trPr>
-          <w:trHeight w:hRule="exact" w:val="5500"/>
-        </w:trPr>
-        <w:tc>
-          <w:tcPr>
-            <w:tcW w:w="9026" w:type="dxa"/>
-            <w:tcBorders>
-              <w:top w:val="single" w:sz="1" w:space="0" w:color="AAAAAA"/>
-              <w:left w:val="single" w:sz="1" w:space="0" w:color="AAAAAA"/>
-              <w:bottom w:val="single" w:sz="1" w:space="0" w:color="AAAAAA"/>
-              <w:right w:val="single" w:sz="1" w:space="0" w:color="AAAAAA"/>
-            </w:tcBorders>
-            <w:shd w:val="clear" w:color="auto" w:fill="F0F0F0"/>
-            <w:tcMar>
-              <w:top w:w="120" w:type="dxa"/>
-              <w:left w:w="120" w:type="dxa"/>
-              <w:bottom w:w="120" w:type="dxa"/>
-              <w:right w:w="120" w:type="dxa"/>
-            </w:tcMar>
-            <w:vAlign w:val="center"/>
-          </w:tcPr>
-          <w:p>
-            <w:pPr>
-              <w:jc w:val="center"/>
-            </w:pPr>
-            <w:r>
-              <w:rPr>
-                <w:b/>
-                <w:bCs/>
-                <w:color w:val="888888"/>
-                <w:sz w:val="22"/>
-                <w:szCs w:val="22"/>
-              </w:rPr>
-              <w:lastRenderedPageBreak/>
-              <w:t xml:space="preserve">[ SISIPKAN GAMBAR DI </w:t>
-            </w:r>
-            <w:proofErr w:type="gramStart"/>
-            <w:r>
-              <w:rPr>
-                <w:b/>
-                <w:bCs/>
-                <w:color w:val="888888"/>
-                <w:sz w:val="22"/>
-                <w:szCs w:val="22"/>
-              </w:rPr>
-              <w:t>SINI ]</w:t>
-            </w:r>
-            <w:proofErr w:type="gramEnd"/>
-          </w:p>
-          <w:p>
-            <w:pPr>
-              <w:jc w:val="center"/>
-            </w:pPr>
-            <w:r>
-              <w:rPr>
-                <w:i/>
-                <w:iCs/>
-                <w:color w:val="666666"/>
-                <w:sz w:val="20"/>
-                <w:szCs w:val="20"/>
-              </w:rPr>
-              <w:t>Lampiran 5. Screenshot Layout View Peta Final di ArcMap</w:t>
-            </w:r>
-          </w:p>
-        </w:tc>
-      </w:tr>
-    </w:tbl>
-    <w:p>
-      <w:pPr>
-        <w:spacing w:before="80" w:after="160"/>
-        <w:jc w:val="center"/>
-      </w:pPr>
-      <w:r>
-        <w:rPr>
-          <w:b/>
-          <w:bCs/>
-          <w:sz w:val="22"/>
-          <w:szCs w:val="22"/>
-        </w:rPr>
-        <w:t>Lampiran 5. Screenshot Layout View Peta Final di ArcMap</w:t>
-      </w:r>
     </w:p>
     <w:sectPr>
       <w:headerReference w:type="default" r:id="rId8"/>

</xml_diff>